<commit_message>
APA 7 references; Word version mirrors PDF cover and styles; add reproducible docx build script
</commit_message>
<xml_diff>
--- a/group_12/report/report_12.docx
+++ b/group_12/report/report_12.docx
@@ -2,134 +2,254 @@
 <file path=word/document.xml><?xml version="1.0" encoding="utf-8"?>
 <w:document xmlns:w="http://schemas.openxmlformats.org/wordprocessingml/2006/main" xmlns:m="http://schemas.openxmlformats.org/officeDocument/2006/math" xmlns:r="http://schemas.openxmlformats.org/officeDocument/2006/relationships" xmlns:o="urn:schemas-microsoft-com:office:office" xmlns:v="urn:schemas-microsoft-com:vml" xmlns:w10="urn:schemas-microsoft-com:office:word" xmlns:a="http://schemas.openxmlformats.org/drawingml/2006/main" xmlns:pic="http://schemas.openxmlformats.org/drawingml/2006/picture" xmlns:wp="http://schemas.openxmlformats.org/drawingml/2006/wordprocessingDrawing">
   <w:body>
-    <w:p>
-      <w:pPr>
-        <w:pStyle w:val="Title"/>
-      </w:pPr>
-      <w:r>
-        <w:t xml:space="preserve">Market Sentiment Classification of Financial Tweets</w:t>
-      </w:r>
-    </w:p>
-    <w:p>
-      <w:pPr>
-        <w:pStyle w:val="Subtitle"/>
-      </w:pPr>
-      <w:r>
-        <w:t xml:space="preserve">Text Mining — Project Report</w:t>
-      </w:r>
-    </w:p>
-    <w:p>
-      <w:pPr>
-        <w:pStyle w:val="Subtitle"/>
-      </w:pPr>
-      <w:r>
-        <w:t xml:space="preserve">NOVA IMS, Information Management School — Spring Semester 2025/2026</w:t>
-      </w:r>
-    </w:p>
-    <w:p>
-      <w:pPr>
-        <w:pStyle w:val="BodyText"/>
-      </w:pPr>
-      <w:r>
-        <w:rPr>
+    <w:bookmarkStart w:id="33" w:name="data-exploration"/>
+    <w:p>
+      <w:pPr>
+        <w:spacing w:after="80" w:line="276" w:lineRule="auto"/>
+        <w:jc w:val="center"/>
+      </w:pPr>
+      <w:r>
+        <w:rPr>
+          <w:rFonts w:ascii="Cambria" w:hAnsi="Cambria"/>
+          <w:b w:val="0"/>
+          <w:sz w:val="22"/>
+        </w:rPr>
+        <w:t xml:space="preserve"> </w:t>
+      </w:r>
+    </w:p>
+    <w:p>
+      <w:pPr>
+        <w:spacing w:after="80" w:line="276" w:lineRule="auto"/>
+        <w:jc w:val="center"/>
+      </w:pPr>
+      <w:r>
+        <w:rPr>
+          <w:rFonts w:ascii="Cambria" w:hAnsi="Cambria"/>
+          <w:b w:val="0"/>
+          <w:sz w:val="22"/>
+        </w:rPr>
+        <w:t xml:space="preserve"> </w:t>
+      </w:r>
+    </w:p>
+    <w:p>
+      <w:pPr>
+        <w:spacing w:after="80" w:line="276" w:lineRule="auto"/>
+        <w:jc w:val="center"/>
+      </w:pPr>
+      <w:r>
+        <w:rPr>
+          <w:rFonts w:ascii="Cambria" w:hAnsi="Cambria"/>
+          <w:b w:val="0"/>
+          <w:sz w:val="22"/>
+        </w:rPr>
+        <w:t xml:space="preserve"> </w:t>
+      </w:r>
+    </w:p>
+    <w:p>
+      <w:pPr>
+        <w:spacing w:after="80" w:line="276" w:lineRule="auto"/>
+        <w:jc w:val="center"/>
+      </w:pPr>
+      <w:r>
+        <w:rPr>
+          <w:rFonts w:ascii="Cambria" w:hAnsi="Cambria"/>
+          <w:b w:val="0"/>
+          <w:sz w:val="22"/>
+        </w:rPr>
+        <w:t xml:space="preserve"> </w:t>
+      </w:r>
+    </w:p>
+    <w:p>
+      <w:pPr>
+        <w:spacing w:after="80" w:line="276" w:lineRule="auto"/>
+        <w:jc w:val="center"/>
+      </w:pPr>
+      <w:r>
+        <w:rPr>
+          <w:rFonts w:ascii="Cambria" w:hAnsi="Cambria"/>
+          <w:b w:val="0"/>
+          <w:sz w:val="22"/>
+        </w:rPr>
+        <w:t xml:space="preserve"> </w:t>
+      </w:r>
+    </w:p>
+    <w:p>
+      <w:pPr>
+        <w:spacing w:after="80" w:line="276" w:lineRule="auto"/>
+        <w:jc w:val="center"/>
+      </w:pPr>
+      <w:r>
+        <w:rPr>
+          <w:rFonts w:ascii="Cambria" w:hAnsi="Cambria"/>
+          <w:b w:val="0"/>
+          <w:sz w:val="22"/>
+        </w:rPr>
+        <w:t xml:space="preserve"> </w:t>
+      </w:r>
+    </w:p>
+    <w:p>
+      <w:pPr>
+        <w:spacing w:after="80" w:line="276" w:lineRule="auto"/>
+        <w:jc w:val="center"/>
+      </w:pPr>
+      <w:r>
+        <w:rPr>
+          <w:rFonts w:ascii="Cambria" w:hAnsi="Cambria"/>
+          <w:b w:val="0"/>
+          <w:sz w:val="22"/>
+        </w:rPr>
+        <w:t xml:space="preserve"> </w:t>
+      </w:r>
+    </w:p>
+    <w:p>
+      <w:pPr>
+        <w:spacing w:after="360" w:line="276" w:lineRule="auto"/>
+        <w:jc w:val="center"/>
+      </w:pPr>
+      <w:r>
+        <w:rPr>
+          <w:rFonts w:ascii="Cambria" w:hAnsi="Cambria"/>
           <w:b/>
-          <w:bCs/>
-        </w:rPr>
-        <w:t xml:space="preserve">Group 12</w:t>
-      </w:r>
-    </w:p>
-    <w:tbl>
-      <w:tblPr>
-        <w:tblStyle w:val="Table"/>
-        <w:tblW w:type="auto" w:w="0"/>
-        <w:tblLook w:firstRow="0" w:lastRow="0" w:firstColumn="0" w:lastColumn="0" w:noHBand="0" w:noVBand="0" w:val="0000"/>
-      </w:tblPr>
-      <w:tblGrid>
-        <w:gridCol w:w="3960"/>
-        <w:gridCol w:w="3960"/>
-      </w:tblGrid>
-      <w:tr>
-        <w:tc>
-          <w:tcPr/>
-          <w:p>
-            <w:pPr>
-              <w:pStyle w:val="Compact"/>
-            </w:pPr>
-            <w:r>
-              <w:t xml:space="preserve">Artem Polikarpov</w:t>
-            </w:r>
-          </w:p>
-        </w:tc>
-        <w:tc>
-          <w:tcPr/>
-          <w:p>
-            <w:pPr>
-              <w:pStyle w:val="Compact"/>
-            </w:pPr>
-            <w:r>
-              <w:t xml:space="preserve">20250443</w:t>
-            </w:r>
-          </w:p>
-        </w:tc>
-      </w:tr>
-      <w:tr>
-        <w:tc>
-          <w:tcPr/>
-          <w:p>
-            <w:pPr>
-              <w:pStyle w:val="Compact"/>
-            </w:pPr>
-            <w:r>
-              <w:t xml:space="preserve">João Cardoso</w:t>
-            </w:r>
-          </w:p>
-        </w:tc>
-        <w:tc>
-          <w:tcPr/>
-          <w:p>
-            <w:pPr>
-              <w:pStyle w:val="Compact"/>
-            </w:pPr>
-            <w:r>
-              <w:t xml:space="preserve">20240529</w:t>
-            </w:r>
-          </w:p>
-        </w:tc>
-      </w:tr>
-      <w:tr>
-        <w:tc>
-          <w:tcPr/>
-          <w:p>
-            <w:pPr>
-              <w:pStyle w:val="Compact"/>
-            </w:pPr>
-            <w:r>
-              <w:t xml:space="preserve">Simon Sazonov</w:t>
-            </w:r>
-          </w:p>
-        </w:tc>
-        <w:tc>
-          <w:tcPr/>
-          <w:p>
-            <w:pPr>
-              <w:pStyle w:val="Compact"/>
-            </w:pPr>
-            <w:r>
-              <w:t xml:space="preserve">20221689</w:t>
-            </w:r>
-          </w:p>
-        </w:tc>
-      </w:tr>
-    </w:tbl>
-    <w:p>
-      <w:pPr>
-        <w:pStyle w:val="BodyText"/>
-      </w:pPr>
-      <w:r>
-        <w:t xml:space="preserve">June 2026</w:t>
-      </w:r>
-    </w:p>
-    <w:bookmarkStart w:id="33" w:name="data-exploration"/>
+          <w:sz w:val="44"/>
+        </w:rPr>
+        <w:t>Market Sentiment Classification</w:t>
+        <w:br/>
+      </w:r>
+      <w:r>
+        <w:rPr>
+          <w:rFonts w:ascii="Cambria" w:hAnsi="Cambria"/>
+          <w:b/>
+          <w:sz w:val="44"/>
+        </w:rPr>
+        <w:t>of Financial Tweets</w:t>
+      </w:r>
+    </w:p>
+    <w:p>
+      <w:pPr>
+        <w:spacing w:after="160" w:line="276" w:lineRule="auto"/>
+        <w:jc w:val="center"/>
+      </w:pPr>
+      <w:r>
+        <w:rPr>
+          <w:rFonts w:ascii="Cambria" w:hAnsi="Cambria"/>
+          <w:b w:val="0"/>
+          <w:sz w:val="26"/>
+        </w:rPr>
+        <w:t>Text Mining — Project Report</w:t>
+      </w:r>
+    </w:p>
+    <w:p>
+      <w:pPr>
+        <w:spacing w:after="600" w:line="276" w:lineRule="auto"/>
+        <w:jc w:val="center"/>
+      </w:pPr>
+      <w:r>
+        <w:rPr>
+          <w:rFonts w:ascii="Cambria" w:hAnsi="Cambria"/>
+          <w:b w:val="0"/>
+          <w:sz w:val="23"/>
+        </w:rPr>
+        <w:t>NOVA IMS, Information Management School</w:t>
+        <w:br/>
+      </w:r>
+      <w:r>
+        <w:rPr>
+          <w:rFonts w:ascii="Cambria" w:hAnsi="Cambria"/>
+          <w:b w:val="0"/>
+          <w:sz w:val="23"/>
+        </w:rPr>
+        <w:t>Spring Semester 2025/2026</w:t>
+      </w:r>
+    </w:p>
+    <w:p>
+      <w:pPr>
+        <w:spacing w:after="160" w:line="276" w:lineRule="auto"/>
+        <w:jc w:val="center"/>
+      </w:pPr>
+      <w:r>
+        <w:rPr>
+          <w:rFonts w:ascii="Cambria" w:hAnsi="Cambria"/>
+          <w:b/>
+          <w:sz w:val="24"/>
+        </w:rPr>
+        <w:t>Group 12</w:t>
+      </w:r>
+    </w:p>
+    <w:p>
+      <w:pPr>
+        <w:spacing w:after="40" w:line="276" w:lineRule="auto"/>
+        <w:jc w:val="center"/>
+      </w:pPr>
+      <w:r>
+        <w:rPr>
+          <w:rFonts w:ascii="Cambria" w:hAnsi="Cambria"/>
+          <w:b w:val="0"/>
+          <w:sz w:val="22"/>
+        </w:rPr>
+        <w:t>Artem Polikarpov  20250443</w:t>
+      </w:r>
+    </w:p>
+    <w:p>
+      <w:pPr>
+        <w:spacing w:after="40" w:line="276" w:lineRule="auto"/>
+        <w:jc w:val="center"/>
+      </w:pPr>
+      <w:r>
+        <w:rPr>
+          <w:rFonts w:ascii="Cambria" w:hAnsi="Cambria"/>
+          <w:b w:val="0"/>
+          <w:sz w:val="22"/>
+        </w:rPr>
+        <w:t>João Cardoso  20240529</w:t>
+      </w:r>
+    </w:p>
+    <w:p>
+      <w:pPr>
+        <w:spacing w:after="40" w:line="276" w:lineRule="auto"/>
+        <w:jc w:val="center"/>
+      </w:pPr>
+      <w:r>
+        <w:rPr>
+          <w:rFonts w:ascii="Cambria" w:hAnsi="Cambria"/>
+          <w:b w:val="0"/>
+          <w:sz w:val="22"/>
+        </w:rPr>
+        <w:t>Simon Sazonov  20221689</w:t>
+      </w:r>
+    </w:p>
+    <w:p>
+      <w:pPr>
+        <w:spacing w:after="480" w:line="276" w:lineRule="auto"/>
+        <w:jc w:val="center"/>
+      </w:pPr>
+      <w:r>
+        <w:rPr>
+          <w:rFonts w:ascii="Cambria" w:hAnsi="Cambria"/>
+          <w:b w:val="0"/>
+          <w:sz w:val="22"/>
+        </w:rPr>
+        <w:t xml:space="preserve"> </w:t>
+      </w:r>
+    </w:p>
+    <w:p>
+      <w:pPr>
+        <w:spacing w:after="80" w:line="276" w:lineRule="auto"/>
+        <w:jc w:val="center"/>
+      </w:pPr>
+      <w:r>
+        <w:rPr>
+          <w:rFonts w:ascii="Cambria" w:hAnsi="Cambria"/>
+          <w:b w:val="0"/>
+          <w:sz w:val="22"/>
+        </w:rPr>
+        <w:t>June 2026</w:t>
+      </w:r>
+    </w:p>
+    <w:p>
+      <w:r>
+        <w:br w:type="page"/>
+      </w:r>
+    </w:p>
     <w:p>
       <w:pPr>
         <w:pStyle w:val="Heading1"/>
@@ -2690,251 +2810,244 @@
         <w:pStyle w:val="Heading1"/>
       </w:pPr>
       <w:r>
-        <w:rPr>
-          <w:rStyle w:val="SectionNumber"/>
-        </w:rPr>
-        <w:t xml:space="preserve">7</w:t>
-      </w:r>
-      <w:r>
-        <w:tab/>
-      </w:r>
-      <w:r>
         <w:t xml:space="preserve">References</w:t>
       </w:r>
     </w:p>
     <w:p>
       <w:pPr>
-        <w:pStyle w:val="Compact"/>
-        <w:numPr>
-          <w:ilvl w:val="0"/>
-          <w:numId w:val="1002"/>
-        </w:numPr>
-      </w:pPr>
-      <w:r>
-        <w:t xml:space="preserve">Araci, D. (2019). FinBERT: Financial Sentiment Analysis with Pre-trained Language Models.</w:t>
-      </w:r>
-      <w:r>
-        <w:t xml:space="preserve"> </w:t>
-      </w:r>
-      <w:r>
-        <w:rPr>
-          <w:i/>
-          <w:iCs/>
-        </w:rPr>
-        <w:t xml:space="preserve">arXiv:1908.10063</w:t>
-      </w:r>
-      <w:r>
-        <w:t xml:space="preserve">.</w:t>
-      </w:r>
-    </w:p>
-    <w:p>
-      <w:pPr>
-        <w:pStyle w:val="Compact"/>
-        <w:numPr>
-          <w:ilvl w:val="0"/>
-          <w:numId w:val="1002"/>
-        </w:numPr>
-      </w:pPr>
-      <w:r>
-        <w:t xml:space="preserve">Barbieri, F., Camacho-Collados, J., Espinosa Anke, L., &amp; Neves, L. (2020). TweetEval: Unified Benchmark and Comparative Evaluation for Tweet Classification.</w:t>
-      </w:r>
-      <w:r>
-        <w:t xml:space="preserve"> </w:t>
-      </w:r>
-      <w:r>
-        <w:rPr>
-          <w:i/>
-          <w:iCs/>
-        </w:rPr>
-        <w:t xml:space="preserve">Findings of EMNLP 2020</w:t>
-      </w:r>
-      <w:r>
-        <w:t xml:space="preserve">.</w:t>
-      </w:r>
-    </w:p>
-    <w:p>
-      <w:pPr>
-        <w:pStyle w:val="Compact"/>
-        <w:numPr>
-          <w:ilvl w:val="0"/>
-          <w:numId w:val="1002"/>
-        </w:numPr>
-      </w:pPr>
-      <w:r>
-        <w:t xml:space="preserve">Devlin, J., Chang, M.-W., Lee, K., &amp; Toutanova, K. (2019). BERT: Pre-training of Deep Bidirectional Transformers for Language Understanding.</w:t>
-      </w:r>
-      <w:r>
-        <w:t xml:space="preserve"> </w:t>
-      </w:r>
-      <w:r>
-        <w:rPr>
-          <w:i/>
-          <w:iCs/>
-        </w:rPr>
-        <w:t xml:space="preserve">NAACL-HLT 2019</w:t>
-      </w:r>
-      <w:r>
-        <w:t xml:space="preserve">.</w:t>
-      </w:r>
-    </w:p>
-    <w:p>
-      <w:pPr>
-        <w:pStyle w:val="Compact"/>
-        <w:numPr>
-          <w:ilvl w:val="0"/>
-          <w:numId w:val="1002"/>
-        </w:numPr>
-      </w:pPr>
-      <w:r>
-        <w:t xml:space="preserve">Liu, Y., Ott, M., Goyal, N., Du, J., Joshi, M., Chen, D., Levy, O., Lewis, M., Zettlemoyer, L., &amp; Stoyanov, V. (2019). RoBERTa: A Robustly Optimized BERT Pretraining Approach.</w:t>
-      </w:r>
-      <w:r>
-        <w:t xml:space="preserve"> </w:t>
-      </w:r>
-      <w:r>
-        <w:rPr>
-          <w:i/>
-          <w:iCs/>
-        </w:rPr>
-        <w:t xml:space="preserve">arXiv:1907.11692</w:t>
-      </w:r>
-      <w:r>
-        <w:t xml:space="preserve">.</w:t>
-      </w:r>
-    </w:p>
-    <w:p>
-      <w:pPr>
-        <w:pStyle w:val="Compact"/>
-        <w:numPr>
-          <w:ilvl w:val="0"/>
-          <w:numId w:val="1002"/>
-        </w:numPr>
-      </w:pPr>
-      <w:r>
-        <w:t xml:space="preserve">Loureiro, D., Barbieri, F., Neves, L., Espinosa Anke, L., &amp; Camacho-Collados, J. (2022). TimeLMs: Diachronic Language Models from Twitter.</w:t>
-      </w:r>
-      <w:r>
-        <w:t xml:space="preserve"> </w:t>
-      </w:r>
-      <w:r>
-        <w:rPr>
-          <w:i/>
-          <w:iCs/>
-        </w:rPr>
-        <w:t xml:space="preserve">ACL 2022 System Demonstrations</w:t>
-      </w:r>
-      <w:r>
-        <w:t xml:space="preserve">.</w:t>
-      </w:r>
-    </w:p>
-    <w:p>
-      <w:pPr>
-        <w:pStyle w:val="Compact"/>
-        <w:numPr>
-          <w:ilvl w:val="0"/>
-          <w:numId w:val="1002"/>
-        </w:numPr>
-      </w:pPr>
-      <w:r>
-        <w:t xml:space="preserve">Mikolov, T., Sutskever, I., Chen, K., Corrado, G., &amp; Dean, J. (2013). Distributed Representations of Words and Phrases and their Compositionality.</w:t>
-      </w:r>
-      <w:r>
-        <w:t xml:space="preserve"> </w:t>
-      </w:r>
-      <w:r>
-        <w:rPr>
-          <w:i/>
-          <w:iCs/>
-        </w:rPr>
-        <w:t xml:space="preserve">NeurIPS 2013</w:t>
-      </w:r>
-      <w:r>
-        <w:t xml:space="preserve">.</w:t>
-      </w:r>
-    </w:p>
-    <w:p>
-      <w:pPr>
-        <w:pStyle w:val="Compact"/>
-        <w:numPr>
-          <w:ilvl w:val="0"/>
-          <w:numId w:val="1002"/>
-        </w:numPr>
-      </w:pPr>
-      <w:r>
-        <w:t xml:space="preserve">Radford, A., Wu, J., Child, R., Luan, D., Amodei, D., &amp; Sutskever, I. (2019). Language Models are Unsupervised Multitask Learners.</w:t>
-      </w:r>
-      <w:r>
-        <w:t xml:space="preserve"> </w:t>
-      </w:r>
-      <w:r>
-        <w:rPr>
-          <w:i/>
-          <w:iCs/>
-        </w:rPr>
-        <w:t xml:space="preserve">OpenAI Technical Report</w:t>
-      </w:r>
-      <w:r>
-        <w:t xml:space="preserve">.</w:t>
-      </w:r>
-    </w:p>
-    <w:p>
-      <w:pPr>
-        <w:pStyle w:val="Compact"/>
-        <w:numPr>
-          <w:ilvl w:val="0"/>
-          <w:numId w:val="1002"/>
-        </w:numPr>
-      </w:pPr>
-      <w:r>
-        <w:t xml:space="preserve">Sun, C., Qiu, X., Xu, Y., &amp; Huang, X. (2019). How to Fine-Tune BERT for Text Classification?</w:t>
-      </w:r>
-      <w:r>
-        <w:t xml:space="preserve"> </w:t>
-      </w:r>
-      <w:r>
-        <w:rPr>
-          <w:i/>
-          <w:iCs/>
-        </w:rPr>
-        <w:t xml:space="preserve">China National Conference on Chinese Computational Linguistics (CCL 2019)</w:t>
-      </w:r>
-      <w:r>
-        <w:t xml:space="preserve">.</w:t>
-      </w:r>
-    </w:p>
-    <w:p>
-      <w:pPr>
-        <w:pStyle w:val="Compact"/>
-        <w:numPr>
-          <w:ilvl w:val="0"/>
-          <w:numId w:val="1002"/>
-        </w:numPr>
-      </w:pPr>
-      <w:r>
-        <w:t xml:space="preserve">Wang, W., Wei, F., Dong, L., Bao, H., Yang, N., &amp; Zhou, M. (2020). MiniLM: Deep Self-Attention Distillation for Task-Agnostic Compression of Pre-Trained Transformers.</w:t>
-      </w:r>
-      <w:r>
-        <w:t xml:space="preserve"> </w:t>
-      </w:r>
-      <w:r>
-        <w:rPr>
-          <w:i/>
-          <w:iCs/>
-        </w:rPr>
-        <w:t xml:space="preserve">NeurIPS 2020</w:t>
-      </w:r>
-      <w:r>
-        <w:t xml:space="preserve">.</w:t>
+        <w:pStyle w:val="FirstParagraph"/>
+        <w:spacing w:line="360" w:lineRule="auto"/>
+        <w:ind w:left="720" w:hanging="720"/>
+      </w:pPr>
+      <w:r>
+        <w:t xml:space="preserve">Araci, D. (2019).</w:t>
+      </w:r>
+      <w:r>
+        <w:t xml:space="preserve"> </w:t>
+      </w:r>
+      <w:r>
+        <w:rPr>
+          <w:i/>
+          <w:iCs/>
+        </w:rPr>
+        <w:t xml:space="preserve">FinBERT: Financial sentiment analysis with pre-trained language models</w:t>
+      </w:r>
+      <w:r>
+        <w:t xml:space="preserve">. arXiv. https://arxiv.org/abs/1908.10063</w:t>
+      </w:r>
+    </w:p>
+    <w:p>
+      <w:pPr>
+        <w:pStyle w:val="BodyText"/>
+        <w:spacing w:line="360" w:lineRule="auto"/>
+        <w:ind w:left="720" w:hanging="720"/>
+      </w:pPr>
+      <w:r>
+        <w:t xml:space="preserve">Barbieri, F., Camacho-Collados, J., Espinosa Anke, L., &amp; Neves, L. (2020). TweetEval: Unified benchmark and comparative evaluation for tweet classification.</w:t>
+      </w:r>
+      <w:r>
+        <w:t xml:space="preserve"> </w:t>
+      </w:r>
+      <w:r>
+        <w:rPr>
+          <w:i/>
+          <w:iCs/>
+        </w:rPr>
+        <w:t xml:space="preserve">Findings of the Association for Computational Linguistics: EMNLP 2020</w:t>
+      </w:r>
+      <w:r>
+        <w:t xml:space="preserve">. https://arxiv.org/abs/2010.12421</w:t>
+      </w:r>
+    </w:p>
+    <w:p>
+      <w:pPr>
+        <w:pStyle w:val="BodyText"/>
+        <w:spacing w:line="360" w:lineRule="auto"/>
+        <w:ind w:left="720" w:hanging="720"/>
+      </w:pPr>
+      <w:r>
+        <w:t xml:space="preserve">Devlin, J., Chang, M.-W., Lee, K., &amp; Toutanova, K. (2019). BERT: Pre-training of deep bidirectional transformers for language understanding.</w:t>
+      </w:r>
+      <w:r>
+        <w:t xml:space="preserve"> </w:t>
+      </w:r>
+      <w:r>
+        <w:rPr>
+          <w:i/>
+          <w:iCs/>
+        </w:rPr>
+        <w:t xml:space="preserve">Proceedings of the 2019 Conference of the North American Chapter of the Association for Computational Linguistics: Human Language Technologies</w:t>
+      </w:r>
+      <w:r>
+        <w:t xml:space="preserve">. https://arxiv.org/abs/1810.04805</w:t>
+      </w:r>
+    </w:p>
+    <w:p>
+      <w:pPr>
+        <w:pStyle w:val="BodyText"/>
+        <w:spacing w:line="360" w:lineRule="auto"/>
+        <w:ind w:left="720" w:hanging="720"/>
+      </w:pPr>
+      <w:r>
+        <w:t xml:space="preserve">Liu, Y., Ott, M., Goyal, N., Du, J., Joshi, M., Chen, D., Levy, O., Lewis, M., Zettlemoyer, L., &amp; Stoyanov, V. (2019).</w:t>
+      </w:r>
+      <w:r>
+        <w:t xml:space="preserve"> </w:t>
+      </w:r>
+      <w:r>
+        <w:rPr>
+          <w:i/>
+          <w:iCs/>
+        </w:rPr>
+        <w:t xml:space="preserve">RoBERTa: A robustly optimized BERT pretraining approach</w:t>
+      </w:r>
+      <w:r>
+        <w:t xml:space="preserve">. arXiv. https://arxiv.org/abs/1907.11692</w:t>
+      </w:r>
+    </w:p>
+    <w:p>
+      <w:pPr>
+        <w:pStyle w:val="BodyText"/>
+        <w:spacing w:line="360" w:lineRule="auto"/>
+        <w:ind w:left="720" w:hanging="720"/>
+      </w:pPr>
+      <w:r>
+        <w:t xml:space="preserve">Loureiro, D., Barbieri, F., Neves, L., Espinosa Anke, L., &amp; Camacho-Collados, J. (2022). TimeLMs: Diachronic language models from Twitter.</w:t>
+      </w:r>
+      <w:r>
+        <w:t xml:space="preserve"> </w:t>
+      </w:r>
+      <w:r>
+        <w:rPr>
+          <w:i/>
+          <w:iCs/>
+        </w:rPr>
+        <w:t xml:space="preserve">Proceedings of the 60th Annual Meeting of the Association for Computational Linguistics: System Demonstrations</w:t>
+      </w:r>
+      <w:r>
+        <w:t xml:space="preserve">. https://arxiv.org/abs/2202.03829</w:t>
+      </w:r>
+    </w:p>
+    <w:p>
+      <w:pPr>
+        <w:pStyle w:val="BodyText"/>
+        <w:spacing w:line="360" w:lineRule="auto"/>
+        <w:ind w:left="720" w:hanging="720"/>
+      </w:pPr>
+      <w:r>
+        <w:t xml:space="preserve">Mikolov, T., Sutskever, I., Chen, K., Corrado, G. S., &amp; Dean, J. (2013). Distributed representations of words and phrases and their compositionality.</w:t>
+      </w:r>
+      <w:r>
+        <w:t xml:space="preserve"> </w:t>
+      </w:r>
+      <w:r>
+        <w:rPr>
+          <w:i/>
+          <w:iCs/>
+        </w:rPr>
+        <w:t xml:space="preserve">Advances in Neural Information Processing Systems, 26</w:t>
+      </w:r>
+      <w:r>
+        <w:t xml:space="preserve">. https://arxiv.org/abs/1310.4546</w:t>
+      </w:r>
+    </w:p>
+    <w:p>
+      <w:pPr>
+        <w:pStyle w:val="BodyText"/>
+        <w:spacing w:line="360" w:lineRule="auto"/>
+        <w:ind w:left="720" w:hanging="720"/>
+      </w:pPr>
+      <w:r>
+        <w:t xml:space="preserve">Radford, A., Wu, J., Child, R., Luan, D., Amodei, D., &amp; Sutskever, I. (2019).</w:t>
+      </w:r>
+      <w:r>
+        <w:t xml:space="preserve"> </w:t>
+      </w:r>
+      <w:r>
+        <w:rPr>
+          <w:i/>
+          <w:iCs/>
+        </w:rPr>
+        <w:t xml:space="preserve">Language models are unsupervised multitask learners</w:t>
+      </w:r>
+      <w:r>
+        <w:t xml:space="preserve">. OpenAI. https://cdn.openai.com/better-language-models/language_models_are_unsupervised_multitask_learners.pdf</w:t>
+      </w:r>
+    </w:p>
+    <w:p>
+      <w:pPr>
+        <w:pStyle w:val="BodyText"/>
+        <w:spacing w:line="360" w:lineRule="auto"/>
+        <w:ind w:left="720" w:hanging="720"/>
+      </w:pPr>
+      <w:r>
+        <w:t xml:space="preserve">Sun, C., Qiu, X., Xu, Y., &amp; Huang, X. (2019). How to fine-tune BERT for text classification?</w:t>
+      </w:r>
+      <w:r>
+        <w:t xml:space="preserve"> </w:t>
+      </w:r>
+      <w:r>
+        <w:rPr>
+          <w:i/>
+          <w:iCs/>
+        </w:rPr>
+        <w:t xml:space="preserve">Chinese Computational Linguistics (CCL 2019)</w:t>
+      </w:r>
+      <w:r>
+        <w:t xml:space="preserve">. Springer. https://arxiv.org/abs/1905.05583</w:t>
+      </w:r>
+    </w:p>
+    <w:p>
+      <w:pPr>
+        <w:pStyle w:val="BodyText"/>
+        <w:spacing w:line="360" w:lineRule="auto"/>
+        <w:ind w:left="720" w:hanging="720"/>
+      </w:pPr>
+      <w:r>
+        <w:t xml:space="preserve">Wang, W., Wei, F., Dong, L., Bao, H., Yang, N., &amp; Zhou, M. (2020). MiniLM: Deep self-attention distillation for task-agnostic compression of pre-trained transformers.</w:t>
+      </w:r>
+      <w:r>
+        <w:t xml:space="preserve"> </w:t>
+      </w:r>
+      <w:r>
+        <w:rPr>
+          <w:i/>
+          <w:iCs/>
+        </w:rPr>
+        <w:t xml:space="preserve">Advances in Neural Information Processing Systems, 33</w:t>
+      </w:r>
+      <w:r>
+        <w:t xml:space="preserve">. https://arxiv.org/abs/2002.10957</w:t>
       </w:r>
     </w:p>
     <w:bookmarkEnd w:id="60"/>
-    <w:sectPr/>
+    <w:sectPr>
+      <w:titlePg/>
+      <w:footerReference w:type="default" r:id="rId9"/>
+      <w:pgNumType w:start="0"/>
+    </w:sectPr>
   </w:body>
 </w:document>
 </file>
 
 <file path=word/comments.xml><?xml version="1.0" encoding="utf-8"?>
 <w:comments xmlns:w="http://schemas.openxmlformats.org/wordprocessingml/2006/main" xmlns:m="http://schemas.openxmlformats.org/officeDocument/2006/math" xmlns:r="http://schemas.openxmlformats.org/officeDocument/2006/relationships" xmlns:o="urn:schemas-microsoft-com:office:office" xmlns:v="urn:schemas-microsoft-com:vml" xmlns:w10="urn:schemas-microsoft-com:office:word" xmlns:a="http://schemas.openxmlformats.org/drawingml/2006/main" xmlns:pic="http://schemas.openxmlformats.org/drawingml/2006/picture" xmlns:wp="http://schemas.openxmlformats.org/drawingml/2006/wordprocessingDrawing"/>
+</file>
+
+<file path=word/footer1.xml><?xml version="1.0" encoding="utf-8"?>
+<w:ftr xmlns:m="http://schemas.openxmlformats.org/officeDocument/2006/math" xmlns:mc="http://schemas.openxmlformats.org/markup-compatibility/2006" xmlns:mo="http://schemas.microsoft.com/office/mac/office/2008/main" xmlns:mv="urn:schemas-microsoft-com:mac:vml" xmlns:o="urn:schemas-microsoft-com:office:office" xmlns:r="http://schemas.openxmlformats.org/officeDocument/2006/relationships" xmlns:v="urn:schemas-microsoft-com:vml" xmlns:w10="urn:schemas-microsoft-com:office:word" xmlns:w14="http://schemas.microsoft.com/office/word/2010/wordml" xmlns:w="http://schemas.openxmlformats.org/wordprocessingml/2006/main" xmlns:wne="http://schemas.microsoft.com/office/word/2006/wordml" xmlns:wp14="http://schemas.microsoft.com/office/word/2010/wordprocessingDrawing" xmlns:wp="http://schemas.openxmlformats.org/drawingml/2006/wordprocessingDrawing" xmlns:wpc="http://schemas.microsoft.com/office/word/2010/wordprocessingCanvas" xmlns:wpg="http://schemas.microsoft.com/office/word/2010/wordprocessingGroup" xmlns:wpi="http://schemas.microsoft.com/office/word/2010/wordprocessingInk" xmlns:wps="http://schemas.microsoft.com/office/word/2010/wordprocessingShape" mc:Ignorable="w14 wp14">
+  <w:p>
+    <w:pPr>
+      <w:pStyle w:val="Footer"/>
+      <w:jc w:val="center"/>
+    </w:pPr>
+    <w:fldSimple w:instr="PAGE">
+      <w:r>
+        <w:t>1</w:t>
+      </w:r>
+    </w:fldSimple>
+  </w:p>
+</w:ftr>
 </file>
 
 <file path=word/footnotes.xml><?xml version="1.0" encoding="utf-8"?>
@@ -3141,9 +3254,6 @@
     <w:abstractNumId w:val="990"/>
   </w:num>
   <w:num w:numId="1001">
-    <w:abstractNumId w:val="991"/>
-  </w:num>
-  <w:num w:numId="1002">
     <w:abstractNumId w:val="991"/>
   </w:num>
 </w:numbering>
@@ -3174,6 +3284,7 @@
       <w:spacing w:line="360" w:lineRule="auto"/>
     </w:pPr>
     <w:rPr>
+      <w:rFonts w:ascii="Cambria" w:hAnsi="Cambria"/>
       <w:sz w:val="22"/>
     </w:rPr>
   </w:style>
@@ -3214,7 +3325,7 @@
       <w:jc w:val="center"/>
     </w:pPr>
     <w:rPr>
-      <w:rFonts w:asciiTheme="majorHAnsi" w:cstheme="majorBidi" w:eastAsiaTheme="majorEastAsia" w:hAnsiTheme="majorHAnsi"/>
+      <w:rFonts w:ascii="Cambria" w:hAnsi="Cambria"/>
       <w:spacing w:val="-10"/>
       <w:kern w:val="28"/>
       <w:sz w:val="56"/>
@@ -3340,13 +3451,14 @@
     <w:pPr>
       <w:keepNext/>
       <w:keepLines/>
-      <w:spacing w:after="160" w:before="360"/>
+      <w:spacing w:after="200" w:before="400"/>
       <w:outlineLvl w:val="0"/>
     </w:pPr>
     <w:rPr>
-      <w:rFonts w:asciiTheme="majorHAnsi" w:cstheme="majorBidi" w:eastAsiaTheme="majorEastAsia" w:hAnsiTheme="majorHAnsi"/>
-      <w:color w:themeColor="accent1" w:themeShade="BF" w:val="0F4761"/>
-      <w:sz w:val="40"/>
+      <w:rFonts w:ascii="Cambria" w:hAnsi="Cambria"/>
+      <w:b/>
+      <w:color w:val="000000"/>
+      <w:sz w:val="30"/>
       <w:szCs w:val="40"/>
     </w:rPr>
   </w:style>
@@ -3363,13 +3475,14 @@
     <w:pPr>
       <w:keepNext/>
       <w:keepLines/>
-      <w:spacing w:after="160" w:before="360"/>
+      <w:spacing w:after="200" w:before="400"/>
       <w:outlineLvl w:val="1"/>
     </w:pPr>
     <w:rPr>
-      <w:rFonts w:asciiTheme="majorHAnsi" w:cstheme="majorBidi" w:eastAsiaTheme="majorEastAsia" w:hAnsiTheme="majorHAnsi"/>
-      <w:color w:themeColor="accent1" w:themeShade="BF" w:val="0F4761"/>
-      <w:sz w:val="32"/>
+      <w:rFonts w:ascii="Cambria" w:hAnsi="Cambria"/>
+      <w:b/>
+      <w:color w:val="000000"/>
+      <w:sz w:val="25"/>
       <w:szCs w:val="32"/>
     </w:rPr>
   </w:style>
@@ -3390,7 +3503,7 @@
       <w:outlineLvl w:val="2"/>
     </w:pPr>
     <w:rPr>
-      <w:rFonts w:cstheme="majorBidi" w:eastAsiaTheme="majorEastAsia"/>
+      <w:rFonts w:ascii="Cambria" w:hAnsi="Cambria"/>
       <w:color w:themeColor="accent1" w:themeShade="BF" w:val="0F4761"/>
       <w:sz w:val="28"/>
       <w:szCs w:val="28"/>

</xml_diff>